<commit_message>
Apply the branded cover banner to all documents and welcome emails
Same title-page treatment across the three manuals, the NDA, and the
Subscription Agreement: the branded cover image (logo, tagline,
"Powered by", feature icons) at the top of the title page in place of
the old plain-text wordmark block, with the document title and role
label below it. The two welcome emails (company + user) now open with
the same image as a header banner, hosted at /email-banner.jpg since
inline/base64 images don't render in most email clients.

Co-Authored-By: Claude Sonnet 5 <noreply@anthropic.com>
</commit_message>
<xml_diff>
--- a/public/documents/ARbixo-NDA.docx
+++ b/public/documents/ARbixo-NDA.docx
@@ -4,36 +4,48 @@
   <w:body>
     <w:p>
       <w:pPr>
-        <w:spacing w:after="40"/>
-        <w:jc w:val="center"/>
-      </w:pPr>
-      <w:r>
-        <w:rPr>
-          <w:rFonts w:ascii="Calibri" w:cs="Calibri" w:eastAsia="Calibri" w:hAnsi="Calibri"/>
-          <w:b/>
-          <w:bCs/>
-          <w:color w:val="0B2A5E"/>
-          <w:sz w:val="20"/>
-          <w:szCs w:val="20"/>
-        </w:rPr>
-        <w:t xml:space="preserve">ARbixo</w:t>
-      </w:r>
-    </w:p>
-    <w:p>
-      <w:pPr>
         <w:spacing w:after="320"/>
         <w:jc w:val="center"/>
       </w:pPr>
       <w:r>
-        <w:rPr>
-          <w:rFonts w:ascii="Calibri" w:cs="Calibri" w:eastAsia="Calibri" w:hAnsi="Calibri"/>
-          <w:i/>
-          <w:iCs/>
-          <w:color w:val="6B7280"/>
-          <w:sz w:val="18"/>
-          <w:szCs w:val="18"/>
-        </w:rPr>
-        <w:t xml:space="preserve">Accounting Intelligence. Business Excellence.</w:t>
+        <w:drawing>
+          <wp:inline distT="0" distB="0" distL="0" distR="0">
+            <wp:extent cx="6172200" cy="3476625"/>
+            <wp:effectExtent t="0" r="0" b="0" l="0"/>
+            <wp:docPr id="1" name="" descr="" title=""/>
+            <wp:cNvGraphicFramePr>
+              <a:graphicFrameLocks xmlns:a="http://schemas.openxmlformats.org/drawingml/2006/main" noChangeAspect="1"/>
+            </wp:cNvGraphicFramePr>
+            <a:graphic xmlns:a="http://schemas.openxmlformats.org/drawingml/2006/main">
+              <a:graphicData uri="http://schemas.openxmlformats.org/drawingml/2006/picture">
+                <pic:pic xmlns:pic="http://schemas.openxmlformats.org/drawingml/2006/picture">
+                  <pic:nvPicPr>
+                    <pic:cNvPr id="0" name="" descr=""/>
+                    <pic:cNvPicPr>
+                      <a:picLocks noChangeAspect="1" noChangeArrowheads="1"/>
+                    </pic:cNvPicPr>
+                  </pic:nvPicPr>
+                  <pic:blipFill>
+                    <a:blip r:embed="rId9" cstate="none"/>
+                    <a:srcRect/>
+                    <a:stretch>
+                      <a:fillRect/>
+                    </a:stretch>
+                  </pic:blipFill>
+                  <pic:spPr bwMode="auto">
+                    <a:xfrm>
+                      <a:off x="0" y="0"/>
+                      <a:ext cx="6172200" cy="3476625"/>
+                    </a:xfrm>
+                    <a:prstGeom prst="rect">
+                      <a:avLst/>
+                    </a:prstGeom>
+                  </pic:spPr>
+                </pic:pic>
+              </a:graphicData>
+            </a:graphic>
+          </wp:inline>
+        </w:drawing>
       </w:r>
     </w:p>
     <w:p>

</xml_diff>